<commit_message>
fix(15.22): Mike's Sales Flowchart example ends at step 12 - "testing 1/2/3" removed
Steps 13-15 of his worked shoe-shop example read "testing 1", "testing 2",
"testing 3" - left-over test text in his Word template. On Mike's yes
(2026-10-02) the three cells are emptied in the source file itself, so his
example ends at step 12 ("Send thankyou email 2 weeks later..."), and
data/strategy-capture-tables.json is regenerated from it with
scripts/read-capture-tables.js.

Only the three text runs changed in word/document.xml; every other part of
the file is copied unchanged. All 48 concepts read identically before and
after (the Sales Flowchart is used by no concept yet - it is held under
15.22). Full suite 696 / 15,266 green.

Co-Authored-By: Claude Opus 5.5 <noreply@anthropic.com>
</commit_message>
<xml_diff>
--- a/design/planning-templates/fill-in-tables/Sales Flowchart.docx
+++ b/design/planning-templates/fill-in-tables/Sales Flowchart.docx
@@ -1512,7 +1512,7 @@
                 <w:szCs w:val="24"/>
                 <w:rtl w:val="0"/>
               </w:rPr>
-              <w:t xml:space="preserve">testing 1</w:t>
+              <w:t xml:space="preserve"/>
             </w:r>
             <w:r>
               <w:rPr>
@@ -1555,7 +1555,7 @@
                 <w:szCs w:val="24"/>
                 <w:rtl w:val="0"/>
               </w:rPr>
-              <w:t xml:space="preserve">testing 2</w:t>
+              <w:t xml:space="preserve"/>
             </w:r>
             <w:r>
               <w:rPr>
@@ -1598,7 +1598,7 @@
                 <w:szCs w:val="24"/>
                 <w:rtl w:val="0"/>
               </w:rPr>
-              <w:t xml:space="preserve">testing 3</w:t>
+              <w:t xml:space="preserve"/>
             </w:r>
             <w:r>
               <w:rPr>

</xml_diff>